<commit_message>
Updated support! For V16 PHOSPHORUS U02!
</commit_message>
<xml_diff>
--- a/support.docx
+++ b/support.docx
@@ -36,15 +36,7 @@
           <w:b/>
           <w:sz w:val="48"/>
         </w:rPr>
-        <w:t>1</w:t>
-      </w:r>
-      <w:r>
-        <w:rPr>
-          <w:rFonts w:ascii="Verdana" w:hAnsi="Verdana"/>
-          <w:b/>
-          <w:sz w:val="48"/>
-        </w:rPr>
-        <w:t>6</w:t>
+        <w:t>16</w:t>
       </w:r>
       <w:r>
         <w:rPr>
@@ -188,15 +180,7 @@
           <w:b/>
           <w:sz w:val="48"/>
         </w:rPr>
-        <w:t>Game</w:t>
-      </w:r>
-      <w:r>
-        <w:rPr>
-          <w:rFonts w:ascii="Verdana" w:hAnsi="Verdana"/>
-          <w:b/>
-          <w:sz w:val="48"/>
-        </w:rPr>
-        <w:t xml:space="preserve"> Description: </w:t>
+        <w:t xml:space="preserve">Game Description: </w:t>
       </w:r>
     </w:p>
     <w:p>
@@ -219,6 +203,127 @@
           <w:sz w:val="32"/>
         </w:rPr>
         <w:t>Game combines first person shooter, sandbox and voxel properties. It is uncomplete and in continuous development process.</w:t>
+      </w:r>
+    </w:p>
+    <w:p>
+      <w:pPr>
+        <w:pStyle w:val="NoSpacing"/>
+        <w:jc w:val="center"/>
+      </w:pPr>
+    </w:p>
+    <w:p>
+      <w:pPr>
+        <w:pStyle w:val="NoSpacing"/>
+        <w:pBdr>
+          <w:top w:val="single" w:sz="4" w:space="1" w:color="auto"/>
+          <w:left w:val="single" w:sz="4" w:space="4" w:color="auto"/>
+          <w:bottom w:val="single" w:sz="4" w:space="1" w:color="auto"/>
+          <w:right w:val="single" w:sz="4" w:space="4" w:color="auto"/>
+        </w:pBdr>
+        <w:rPr>
+          <w:rFonts w:ascii="Verdana" w:hAnsi="Verdana"/>
+          <w:b/>
+          <w:sz w:val="48"/>
+        </w:rPr>
+      </w:pPr>
+      <w:r>
+        <w:rPr>
+          <w:rFonts w:ascii="Verdana" w:hAnsi="Verdana"/>
+          <w:b/>
+          <w:sz w:val="48"/>
+        </w:rPr>
+        <w:t>Source Repository:</w:t>
+      </w:r>
+    </w:p>
+    <w:p>
+      <w:pPr>
+        <w:pStyle w:val="NoSpacing"/>
+        <w:pBdr>
+          <w:top w:val="single" w:sz="4" w:space="1" w:color="auto"/>
+          <w:left w:val="single" w:sz="4" w:space="4" w:color="auto"/>
+          <w:bottom w:val="single" w:sz="4" w:space="1" w:color="auto"/>
+          <w:right w:val="single" w:sz="4" w:space="4" w:color="auto"/>
+        </w:pBdr>
+        <w:rPr>
+          <w:sz w:val="32"/>
+        </w:rPr>
+      </w:pPr>
+      <w:hyperlink r:id="rId9" w:history="1">
+        <w:r>
+          <w:rPr>
+            <w:rStyle w:val="Hyperlink"/>
+            <w:sz w:val="32"/>
+          </w:rPr>
+          <w:t>https://github.com/ErmacMKIII/DemolitionSynergy</w:t>
+        </w:r>
+      </w:hyperlink>
+    </w:p>
+    <w:p>
+      <w:pPr>
+        <w:pStyle w:val="NoSpacing"/>
+        <w:jc w:val="center"/>
+      </w:pPr>
+    </w:p>
+    <w:p>
+      <w:pPr>
+        <w:pStyle w:val="NoSpacing"/>
+        <w:pBdr>
+          <w:top w:val="single" w:sz="4" w:space="1" w:color="auto"/>
+          <w:left w:val="single" w:sz="4" w:space="4" w:color="auto"/>
+          <w:bottom w:val="single" w:sz="4" w:space="1" w:color="auto"/>
+          <w:right w:val="single" w:sz="4" w:space="4" w:color="auto"/>
+        </w:pBdr>
+        <w:rPr>
+          <w:rFonts w:ascii="Verdana" w:hAnsi="Verdana"/>
+          <w:b/>
+          <w:sz w:val="48"/>
+        </w:rPr>
+      </w:pPr>
+      <w:r>
+        <w:rPr>
+          <w:rFonts w:ascii="Verdana" w:hAnsi="Verdana"/>
+          <w:b/>
+          <w:sz w:val="48"/>
+        </w:rPr>
+        <w:t>License:</w:t>
+      </w:r>
+    </w:p>
+    <w:p>
+      <w:pPr>
+        <w:pStyle w:val="NoSpacing"/>
+        <w:pBdr>
+          <w:top w:val="single" w:sz="4" w:space="1" w:color="auto"/>
+          <w:left w:val="single" w:sz="4" w:space="4" w:color="auto"/>
+          <w:bottom w:val="single" w:sz="4" w:space="1" w:color="auto"/>
+          <w:right w:val="single" w:sz="4" w:space="4" w:color="auto"/>
+        </w:pBdr>
+        <w:rPr>
+          <w:rFonts w:ascii="Verdana" w:hAnsi="Verdana"/>
+          <w:b/>
+          <w:bCs/>
+          <w:color w:val="C00000"/>
+          <w:sz w:val="32"/>
+        </w:rPr>
+      </w:pPr>
+      <w:r>
+        <w:rPr>
+          <w:rFonts w:ascii="Verdana" w:hAnsi="Verdana"/>
+          <w:b/>
+          <w:bCs/>
+          <w:color w:val="C00000"/>
+          <w:sz w:val="32"/>
+        </w:rPr>
+        <w:t>GNU General Public License v3.0</w:t>
+      </w:r>
+      <w:r>
+        <w:rPr>
+          <w:rFonts w:ascii="Verdana" w:hAnsi="Verdana"/>
+          <w:b/>
+          <w:bCs/>
+          <w:color w:val="C00000"/>
+          <w:sz w:val="32"/>
+        </w:rPr>
+        <w:t xml:space="preserve"> </w:t>
       </w:r>
     </w:p>
     <w:p>
@@ -543,6 +648,7 @@
           <w:b/>
           <w:sz w:val="48"/>
         </w:rPr>
+        <w:lastRenderedPageBreak/>
         <w:t>world</w:t>
       </w:r>
       <w:proofErr w:type="gramEnd"/>
@@ -638,16 +744,6 @@
     <w:p>
       <w:pPr>
         <w:pStyle w:val="NoSpacing"/>
-        <w:rPr>
-          <w:rFonts w:ascii="Verdana" w:hAnsi="Verdana"/>
-          <w:b/>
-          <w:sz w:val="48"/>
-        </w:rPr>
-      </w:pPr>
-    </w:p>
-    <w:p>
-      <w:pPr>
-        <w:pStyle w:val="NoSpacing"/>
         <w:pBdr>
           <w:top w:val="single" w:sz="4" w:space="1" w:color="auto"/>
           <w:left w:val="single" w:sz="4" w:space="4" w:color="auto"/>
@@ -668,7 +764,6 @@
           <w:b/>
           <w:sz w:val="48"/>
         </w:rPr>
-        <w:lastRenderedPageBreak/>
         <w:t>Available commands:</w:t>
       </w:r>
     </w:p>
@@ -1449,6 +1544,7 @@
           <w:sz w:val="32"/>
           <w:szCs w:val="32"/>
         </w:rPr>
+        <w:lastRenderedPageBreak/>
         <w:t>Running the game requires OpenGL 3.3 (on graphic cards since March 2010) or later.</w:t>
       </w:r>
     </w:p>
@@ -1521,7 +1617,7 @@
       <w:r>
         <w:t xml:space="preserve"> (email: </w:t>
       </w:r>
-      <w:hyperlink r:id="rId9" w:history="1">
+      <w:hyperlink r:id="rId10" w:history="1">
         <w:r>
           <w:rPr>
             <w:rStyle w:val="Hyperlink"/>
@@ -1558,8 +1654,8 @@
       </w:r>
     </w:p>
     <w:sectPr>
-      <w:headerReference w:type="default" r:id="rId10"/>
-      <w:footerReference w:type="default" r:id="rId11"/>
+      <w:headerReference w:type="default" r:id="rId11"/>
+      <w:footerReference w:type="default" r:id="rId12"/>
       <w:pgSz w:w="12240" w:h="15840"/>
       <w:pgMar w:top="720" w:right="720" w:bottom="720" w:left="720" w:header="144" w:footer="144" w:gutter="0"/>
       <w:cols w:space="720"/>
@@ -1607,6 +1703,7 @@
         <w:docPartUnique/>
       </w:docPartObj>
     </w:sdtPr>
+    <w:sdtEndPr/>
     <w:sdtContent>
       <w:sdt>
         <w:sdtPr>
@@ -1619,6 +1716,7 @@
             <w:docPartUnique/>
           </w:docPartObj>
         </w:sdtPr>
+        <w:sdtEndPr/>
         <w:sdtContent>
           <w:p>
             <w:pPr>
@@ -1854,6 +1952,7 @@
       <w:dataBinding w:prefixMappings="xmlns:ns0='http://schemas.openxmlformats.org/package/2006/metadata/core-properties' xmlns:ns1='http://purl.org/dc/elements/1.1/'" w:xpath="/ns0:coreProperties[1]/ns1:title[1]" w:storeItemID="{6C3C8BC8-F283-45AE-878A-BAB7291924A1}"/>
       <w:text/>
     </w:sdtPr>
+    <w:sdtEndPr/>
     <w:sdtContent>
       <w:p>
         <w:pPr>
@@ -2825,7 +2924,7 @@
     <w:charset w:val="00"/>
     <w:family w:val="modern"/>
     <w:pitch w:val="fixed"/>
-    <w:sig w:usb0="20002A87" w:usb1="00000000" w:usb2="00000000" w:usb3="00000000" w:csb0="000001FF" w:csb1="00000000"/>
+    <w:sig w:usb0="E0002EFF" w:usb1="C0007843" w:usb2="00000009" w:usb3="00000000" w:csb0="000001FF" w:csb1="00000000"/>
   </w:font>
   <w:font w:name="Wingdings">
     <w:panose1 w:val="05000000000000000000"/>
@@ -2880,7 +2979,10 @@
   <w:rsids>
     <w:rsidRoot w:val="00913FCE"/>
     <w:rsid w:val="00133C44"/>
+    <w:rsid w:val="005D2204"/>
     <w:rsid w:val="00913FCE"/>
+    <w:rsid w:val="00947FFB"/>
+    <w:rsid w:val="00CC63E5"/>
   </w:rsids>
   <m:mathPr>
     <m:mathFont m:val="Cambria Math"/>

</xml_diff>